<commit_message>
update the scan report location link
</commit_message>
<xml_diff>
--- a/docs/TEMPLATE_CONTAINER_SCAN_REPORT.docx
+++ b/docs/TEMPLATE_CONTAINER_SCAN_REPORT.docx
@@ -1,6 +1,6 @@
 
 <file path=word/document.xml><?xml version="1.0" encoding="utf-8"?>
-<w:document xmlns:wpc="http://schemas.microsoft.com/office/word/2010/wordprocessingCanvas" xmlns:cx="http://schemas.microsoft.com/office/drawing/2014/chartex" xmlns:cx1="http://schemas.microsoft.com/office/drawing/2015/9/8/chartex" xmlns:cx2="http://schemas.microsoft.com/office/drawing/2015/10/21/chartex" xmlns:cx3="http://schemas.microsoft.com/office/drawing/2016/5/9/chartex" xmlns:cx4="http://schemas.microsoft.com/office/drawing/2016/5/10/chartex" xmlns:cx5="http://schemas.microsoft.com/office/drawing/2016/5/11/chartex" xmlns:cx6="http://schemas.microsoft.com/office/drawing/2016/5/12/chartex" xmlns:cx7="http://schemas.microsoft.com/office/drawing/2016/5/13/chartex" xmlns:cx8="http://schemas.microsoft.com/office/drawing/2016/5/14/chartex" xmlns:mc="http://schemas.openxmlformats.org/markup-compatibility/2006" xmlns:aink="http://schemas.microsoft.com/office/drawing/2016/ink" xmlns:am3d="http://schemas.microsoft.com/office/drawing/2017/model3d" xmlns:o="urn:schemas-microsoft-com:office:office" xmlns:oel="http://schemas.microsoft.com/office/2019/extlst" xmlns:r="http://schemas.openxmlformats.org/officeDocument/2006/relationships" xmlns:m="http://schemas.openxmlformats.org/officeDocument/2006/math" xmlns:v="urn:schemas-microsoft-com:vml" xmlns:wp14="http://schemas.microsoft.com/office/word/2010/wordprocessingDrawing" xmlns:wp="http://schemas.openxmlformats.org/drawingml/2006/wordprocessingDrawing" xmlns:w10="urn:schemas-microsoft-com:office:word" xmlns:w="http://schemas.openxmlformats.org/wordprocessingml/2006/main" xmlns:w14="http://schemas.microsoft.com/office/word/2010/wordml" xmlns:w15="http://schemas.microsoft.com/office/word/2012/wordml" xmlns:w16cex="http://schemas.microsoft.com/office/word/2018/wordml/cex" xmlns:w16cid="http://schemas.microsoft.com/office/word/2016/wordml/cid" xmlns:w16="http://schemas.microsoft.com/office/word/2018/wordml" xmlns:w16du="http://schemas.microsoft.com/office/word/2023/wordml/word16du" xmlns:w16sdtdh="http://schemas.microsoft.com/office/word/2020/wordml/sdtdatahash" xmlns:w16se="http://schemas.microsoft.com/office/word/2015/wordml/symex" xmlns:wpg="http://schemas.microsoft.com/office/word/2010/wordprocessingGroup" xmlns:wpi="http://schemas.microsoft.com/office/word/2010/wordprocessingInk" xmlns:wne="http://schemas.microsoft.com/office/word/2006/wordml" xmlns:wps="http://schemas.microsoft.com/office/word/2010/wordprocessingShape" mc:Ignorable="w14 w15 w16se w16cid w16 w16cex w16sdtdh w16du wp14">
+<w:document xmlns:wpc="http://schemas.microsoft.com/office/word/2010/wordprocessingCanvas" xmlns:cx="http://schemas.microsoft.com/office/drawing/2014/chartex" xmlns:cx1="http://schemas.microsoft.com/office/drawing/2015/9/8/chartex" xmlns:cx2="http://schemas.microsoft.com/office/drawing/2015/10/21/chartex" xmlns:cx3="http://schemas.microsoft.com/office/drawing/2016/5/9/chartex" xmlns:cx4="http://schemas.microsoft.com/office/drawing/2016/5/10/chartex" xmlns:cx5="http://schemas.microsoft.com/office/drawing/2016/5/11/chartex" xmlns:cx6="http://schemas.microsoft.com/office/drawing/2016/5/12/chartex" xmlns:cx7="http://schemas.microsoft.com/office/drawing/2016/5/13/chartex" xmlns:cx8="http://schemas.microsoft.com/office/drawing/2016/5/14/chartex" xmlns:mc="http://schemas.openxmlformats.org/markup-compatibility/2006" xmlns:m="http://schemas.openxmlformats.org/officeDocument/2006/math" xmlns:aink="http://schemas.microsoft.com/office/drawing/2016/ink" xmlns:am3d="http://schemas.microsoft.com/office/drawing/2017/model3d" xmlns:oel="http://schemas.microsoft.com/office/2019/extlst" xmlns:r="http://schemas.openxmlformats.org/officeDocument/2006/relationships" xmlns:wp14="http://schemas.microsoft.com/office/word/2010/wordprocessingDrawing" xmlns:wp="http://schemas.openxmlformats.org/drawingml/2006/wordprocessingDrawing" xmlns:wpg="http://schemas.microsoft.com/office/word/2010/wordprocessingGroup" xmlns:wpi="http://schemas.microsoft.com/office/word/2010/wordprocessingInk" xmlns:wps="http://schemas.microsoft.com/office/word/2010/wordprocessingShape" xmlns:o="urn:schemas-microsoft-com:office:office" xmlns:v="urn:schemas-microsoft-com:vml" xmlns:w10="urn:schemas-microsoft-com:office:word" xmlns:w="http://schemas.openxmlformats.org/wordprocessingml/2006/main" xmlns:w14="http://schemas.microsoft.com/office/word/2010/wordml" xmlns:w15="http://schemas.microsoft.com/office/word/2012/wordml" xmlns:w16cex="http://schemas.microsoft.com/office/word/2018/wordml/cex" xmlns:w16cid="http://schemas.microsoft.com/office/word/2016/wordml/cid" xmlns:w16="http://schemas.microsoft.com/office/word/2018/wordml" xmlns:w16sdtdh="http://schemas.microsoft.com/office/word/2020/wordml/sdtdatahash" xmlns:w16sdtfl="http://schemas.microsoft.com/office/word/2024/wordml/sdtformatlock" xmlns:w16se="http://schemas.microsoft.com/office/word/2015/wordml/symex" xmlns:w16du="http://schemas.microsoft.com/office/word/2023/wordml/word16du" xmlns:wne="http://schemas.microsoft.com/office/word/2006/wordml" mc:Ignorable="w14 w15 w16se w16cid w16 w16cex w16sdtdh w16sdtfl w16du wp14">
   <w:body>
     <w:p>
       <w:pPr>
@@ -159,11 +159,35 @@
           <w:rPr>
             <w:rStyle w:val="Hyperlink"/>
           </w:rPr>
-          <w:t>Container Security Reports</w:t>
+          <w:t>Container Security R</w:t>
+        </w:r>
+        <w:r>
+          <w:rPr>
+            <w:rStyle w:val="Hyperlink"/>
+          </w:rPr>
+          <w:t>e</w:t>
+        </w:r>
+        <w:r>
+          <w:rPr>
+            <w:rStyle w:val="Hyperlink"/>
+          </w:rPr>
+          <w:t>por</w:t>
+        </w:r>
+        <w:r>
+          <w:rPr>
+            <w:rStyle w:val="Hyperlink"/>
+          </w:rPr>
+          <w:t>t</w:t>
+        </w:r>
+        <w:r>
+          <w:rPr>
+            <w:rStyle w:val="Hyperlink"/>
+          </w:rPr>
+          <w:t>s.</w:t>
         </w:r>
       </w:hyperlink>
       <w:r>
-        <w:t xml:space="preserve">. This </w:t>
+        <w:t xml:space="preserve"> This </w:t>
       </w:r>
       <w:r>
         <w:t xml:space="preserve">folder </w:t>
@@ -279,6 +303,7 @@
         <w:pStyle w:val="Heading1"/>
       </w:pPr>
       <w:r>
+        <w:lastRenderedPageBreak/>
         <w:t xml:space="preserve">Template </w:t>
       </w:r>
       <w:r>
@@ -454,6 +479,7 @@
         <w:pStyle w:val="Heading1"/>
       </w:pPr>
       <w:r>
+        <w:lastRenderedPageBreak/>
         <w:t>Project Details</w:t>
       </w:r>
     </w:p>
@@ -1453,6 +1479,7 @@
         <w:pStyle w:val="Heading1"/>
       </w:pPr>
       <w:r>
+        <w:lastRenderedPageBreak/>
         <w:t>Security Scan Findings by Microservice:</w:t>
       </w:r>
     </w:p>
@@ -4370,7 +4397,7 @@
 </file>
 
 <file path=word/endnotes.xml><?xml version="1.0" encoding="utf-8"?>
-<w:endnotes xmlns:wpc="http://schemas.microsoft.com/office/word/2010/wordprocessingCanvas" xmlns:cx="http://schemas.microsoft.com/office/drawing/2014/chartex" xmlns:cx1="http://schemas.microsoft.com/office/drawing/2015/9/8/chartex" xmlns:cx2="http://schemas.microsoft.com/office/drawing/2015/10/21/chartex" xmlns:cx3="http://schemas.microsoft.com/office/drawing/2016/5/9/chartex" xmlns:cx4="http://schemas.microsoft.com/office/drawing/2016/5/10/chartex" xmlns:cx5="http://schemas.microsoft.com/office/drawing/2016/5/11/chartex" xmlns:cx6="http://schemas.microsoft.com/office/drawing/2016/5/12/chartex" xmlns:cx7="http://schemas.microsoft.com/office/drawing/2016/5/13/chartex" xmlns:cx8="http://schemas.microsoft.com/office/drawing/2016/5/14/chartex" xmlns:mc="http://schemas.openxmlformats.org/markup-compatibility/2006" xmlns:aink="http://schemas.microsoft.com/office/drawing/2016/ink" xmlns:am3d="http://schemas.microsoft.com/office/drawing/2017/model3d" xmlns:o="urn:schemas-microsoft-com:office:office" xmlns:oel="http://schemas.microsoft.com/office/2019/extlst" xmlns:r="http://schemas.openxmlformats.org/officeDocument/2006/relationships" xmlns:m="http://schemas.openxmlformats.org/officeDocument/2006/math" xmlns:v="urn:schemas-microsoft-com:vml" xmlns:wp14="http://schemas.microsoft.com/office/word/2010/wordprocessingDrawing" xmlns:wp="http://schemas.openxmlformats.org/drawingml/2006/wordprocessingDrawing" xmlns:w10="urn:schemas-microsoft-com:office:word" xmlns:w="http://schemas.openxmlformats.org/wordprocessingml/2006/main" xmlns:w14="http://schemas.microsoft.com/office/word/2010/wordml" xmlns:w15="http://schemas.microsoft.com/office/word/2012/wordml" xmlns:w16cex="http://schemas.microsoft.com/office/word/2018/wordml/cex" xmlns:w16cid="http://schemas.microsoft.com/office/word/2016/wordml/cid" xmlns:w16="http://schemas.microsoft.com/office/word/2018/wordml" xmlns:w16du="http://schemas.microsoft.com/office/word/2023/wordml/word16du" xmlns:w16sdtdh="http://schemas.microsoft.com/office/word/2020/wordml/sdtdatahash" xmlns:w16se="http://schemas.microsoft.com/office/word/2015/wordml/symex" xmlns:wpg="http://schemas.microsoft.com/office/word/2010/wordprocessingGroup" xmlns:wpi="http://schemas.microsoft.com/office/word/2010/wordprocessingInk" xmlns:wne="http://schemas.microsoft.com/office/word/2006/wordml" xmlns:wps="http://schemas.microsoft.com/office/word/2010/wordprocessingShape" mc:Ignorable="w14 w15 w16se w16cid w16 w16cex w16sdtdh w16du wp14">
+<w:endnotes xmlns:wpc="http://schemas.microsoft.com/office/word/2010/wordprocessingCanvas" xmlns:cx="http://schemas.microsoft.com/office/drawing/2014/chartex" xmlns:cx1="http://schemas.microsoft.com/office/drawing/2015/9/8/chartex" xmlns:cx2="http://schemas.microsoft.com/office/drawing/2015/10/21/chartex" xmlns:cx3="http://schemas.microsoft.com/office/drawing/2016/5/9/chartex" xmlns:cx4="http://schemas.microsoft.com/office/drawing/2016/5/10/chartex" xmlns:cx5="http://schemas.microsoft.com/office/drawing/2016/5/11/chartex" xmlns:cx6="http://schemas.microsoft.com/office/drawing/2016/5/12/chartex" xmlns:cx7="http://schemas.microsoft.com/office/drawing/2016/5/13/chartex" xmlns:cx8="http://schemas.microsoft.com/office/drawing/2016/5/14/chartex" xmlns:mc="http://schemas.openxmlformats.org/markup-compatibility/2006" xmlns:m="http://schemas.openxmlformats.org/officeDocument/2006/math" xmlns:aink="http://schemas.microsoft.com/office/drawing/2016/ink" xmlns:am3d="http://schemas.microsoft.com/office/drawing/2017/model3d" xmlns:oel="http://schemas.microsoft.com/office/2019/extlst" xmlns:r="http://schemas.openxmlformats.org/officeDocument/2006/relationships" xmlns:wp14="http://schemas.microsoft.com/office/word/2010/wordprocessingDrawing" xmlns:wp="http://schemas.openxmlformats.org/drawingml/2006/wordprocessingDrawing" xmlns:wpg="http://schemas.microsoft.com/office/word/2010/wordprocessingGroup" xmlns:wpi="http://schemas.microsoft.com/office/word/2010/wordprocessingInk" xmlns:wps="http://schemas.microsoft.com/office/word/2010/wordprocessingShape" xmlns:o="urn:schemas-microsoft-com:office:office" xmlns:v="urn:schemas-microsoft-com:vml" xmlns:w10="urn:schemas-microsoft-com:office:word" xmlns:w="http://schemas.openxmlformats.org/wordprocessingml/2006/main" xmlns:w14="http://schemas.microsoft.com/office/word/2010/wordml" xmlns:w15="http://schemas.microsoft.com/office/word/2012/wordml" xmlns:w16cex="http://schemas.microsoft.com/office/word/2018/wordml/cex" xmlns:w16cid="http://schemas.microsoft.com/office/word/2016/wordml/cid" xmlns:w16="http://schemas.microsoft.com/office/word/2018/wordml" xmlns:w16sdtdh="http://schemas.microsoft.com/office/word/2020/wordml/sdtdatahash" xmlns:w16sdtfl="http://schemas.microsoft.com/office/word/2024/wordml/sdtformatlock" xmlns:w16se="http://schemas.microsoft.com/office/word/2015/wordml/symex" xmlns:w16du="http://schemas.microsoft.com/office/word/2023/wordml/word16du" xmlns:wne="http://schemas.microsoft.com/office/word/2006/wordml" mc:Ignorable="w14 w15 w16se w16cid w16 w16cex w16sdtdh w16sdtfl w16du wp14">
   <w:endnote w:type="separator" w:id="-1">
     <w:p>
       <w:r>
@@ -4392,7 +4419,7 @@
 </file>
 
 <file path=word/footer1.xml><?xml version="1.0" encoding="utf-8"?>
-<w:ftr xmlns:wpc="http://schemas.microsoft.com/office/word/2010/wordprocessingCanvas" xmlns:cx="http://schemas.microsoft.com/office/drawing/2014/chartex" xmlns:cx1="http://schemas.microsoft.com/office/drawing/2015/9/8/chartex" xmlns:cx2="http://schemas.microsoft.com/office/drawing/2015/10/21/chartex" xmlns:cx3="http://schemas.microsoft.com/office/drawing/2016/5/9/chartex" xmlns:cx4="http://schemas.microsoft.com/office/drawing/2016/5/10/chartex" xmlns:cx5="http://schemas.microsoft.com/office/drawing/2016/5/11/chartex" xmlns:cx6="http://schemas.microsoft.com/office/drawing/2016/5/12/chartex" xmlns:cx7="http://schemas.microsoft.com/office/drawing/2016/5/13/chartex" xmlns:cx8="http://schemas.microsoft.com/office/drawing/2016/5/14/chartex" xmlns:mc="http://schemas.openxmlformats.org/markup-compatibility/2006" xmlns:aink="http://schemas.microsoft.com/office/drawing/2016/ink" xmlns:am3d="http://schemas.microsoft.com/office/drawing/2017/model3d" xmlns:o="urn:schemas-microsoft-com:office:office" xmlns:oel="http://schemas.microsoft.com/office/2019/extlst" xmlns:r="http://schemas.openxmlformats.org/officeDocument/2006/relationships" xmlns:m="http://schemas.openxmlformats.org/officeDocument/2006/math" xmlns:v="urn:schemas-microsoft-com:vml" xmlns:wp14="http://schemas.microsoft.com/office/word/2010/wordprocessingDrawing" xmlns:wp="http://schemas.openxmlformats.org/drawingml/2006/wordprocessingDrawing" xmlns:w10="urn:schemas-microsoft-com:office:word" xmlns:w="http://schemas.openxmlformats.org/wordprocessingml/2006/main" xmlns:w14="http://schemas.microsoft.com/office/word/2010/wordml" xmlns:w15="http://schemas.microsoft.com/office/word/2012/wordml" xmlns:w16cex="http://schemas.microsoft.com/office/word/2018/wordml/cex" xmlns:w16cid="http://schemas.microsoft.com/office/word/2016/wordml/cid" xmlns:w16="http://schemas.microsoft.com/office/word/2018/wordml" xmlns:w16du="http://schemas.microsoft.com/office/word/2023/wordml/word16du" xmlns:w16sdtdh="http://schemas.microsoft.com/office/word/2020/wordml/sdtdatahash" xmlns:w16se="http://schemas.microsoft.com/office/word/2015/wordml/symex" xmlns:wpg="http://schemas.microsoft.com/office/word/2010/wordprocessingGroup" xmlns:wpi="http://schemas.microsoft.com/office/word/2010/wordprocessingInk" xmlns:wne="http://schemas.microsoft.com/office/word/2006/wordml" xmlns:wps="http://schemas.microsoft.com/office/word/2010/wordprocessingShape" mc:Ignorable="w14 w15 w16se w16cid w16 w16cex w16sdtdh w16du wp14">
+<w:ftr xmlns:wpc="http://schemas.microsoft.com/office/word/2010/wordprocessingCanvas" xmlns:cx="http://schemas.microsoft.com/office/drawing/2014/chartex" xmlns:cx1="http://schemas.microsoft.com/office/drawing/2015/9/8/chartex" xmlns:cx2="http://schemas.microsoft.com/office/drawing/2015/10/21/chartex" xmlns:cx3="http://schemas.microsoft.com/office/drawing/2016/5/9/chartex" xmlns:cx4="http://schemas.microsoft.com/office/drawing/2016/5/10/chartex" xmlns:cx5="http://schemas.microsoft.com/office/drawing/2016/5/11/chartex" xmlns:cx6="http://schemas.microsoft.com/office/drawing/2016/5/12/chartex" xmlns:cx7="http://schemas.microsoft.com/office/drawing/2016/5/13/chartex" xmlns:cx8="http://schemas.microsoft.com/office/drawing/2016/5/14/chartex" xmlns:mc="http://schemas.openxmlformats.org/markup-compatibility/2006" xmlns:m="http://schemas.openxmlformats.org/officeDocument/2006/math" xmlns:aink="http://schemas.microsoft.com/office/drawing/2016/ink" xmlns:am3d="http://schemas.microsoft.com/office/drawing/2017/model3d" xmlns:oel="http://schemas.microsoft.com/office/2019/extlst" xmlns:r="http://schemas.openxmlformats.org/officeDocument/2006/relationships" xmlns:wp14="http://schemas.microsoft.com/office/word/2010/wordprocessingDrawing" xmlns:wp="http://schemas.openxmlformats.org/drawingml/2006/wordprocessingDrawing" xmlns:wpg="http://schemas.microsoft.com/office/word/2010/wordprocessingGroup" xmlns:wpi="http://schemas.microsoft.com/office/word/2010/wordprocessingInk" xmlns:wps="http://schemas.microsoft.com/office/word/2010/wordprocessingShape" xmlns:o="urn:schemas-microsoft-com:office:office" xmlns:v="urn:schemas-microsoft-com:vml" xmlns:w10="urn:schemas-microsoft-com:office:word" xmlns:w="http://schemas.openxmlformats.org/wordprocessingml/2006/main" xmlns:w14="http://schemas.microsoft.com/office/word/2010/wordml" xmlns:w15="http://schemas.microsoft.com/office/word/2012/wordml" xmlns:w16cex="http://schemas.microsoft.com/office/word/2018/wordml/cex" xmlns:w16cid="http://schemas.microsoft.com/office/word/2016/wordml/cid" xmlns:w16="http://schemas.microsoft.com/office/word/2018/wordml" xmlns:w16sdtdh="http://schemas.microsoft.com/office/word/2020/wordml/sdtdatahash" xmlns:w16sdtfl="http://schemas.microsoft.com/office/word/2024/wordml/sdtformatlock" xmlns:w16se="http://schemas.microsoft.com/office/word/2015/wordml/symex" xmlns:w16du="http://schemas.microsoft.com/office/word/2023/wordml/word16du" xmlns:wne="http://schemas.microsoft.com/office/word/2006/wordml" mc:Ignorable="w14 w15 w16se w16cid w16 w16cex w16sdtdh w16sdtfl w16du wp14">
   <w:sdt>
     <w:sdtPr>
       <w:rPr>
@@ -4444,7 +4471,7 @@
 </file>
 
 <file path=word/footer2.xml><?xml version="1.0" encoding="utf-8"?>
-<w:ftr xmlns:wpc="http://schemas.microsoft.com/office/word/2010/wordprocessingCanvas" xmlns:cx="http://schemas.microsoft.com/office/drawing/2014/chartex" xmlns:cx1="http://schemas.microsoft.com/office/drawing/2015/9/8/chartex" xmlns:cx2="http://schemas.microsoft.com/office/drawing/2015/10/21/chartex" xmlns:cx3="http://schemas.microsoft.com/office/drawing/2016/5/9/chartex" xmlns:cx4="http://schemas.microsoft.com/office/drawing/2016/5/10/chartex" xmlns:cx5="http://schemas.microsoft.com/office/drawing/2016/5/11/chartex" xmlns:cx6="http://schemas.microsoft.com/office/drawing/2016/5/12/chartex" xmlns:cx7="http://schemas.microsoft.com/office/drawing/2016/5/13/chartex" xmlns:cx8="http://schemas.microsoft.com/office/drawing/2016/5/14/chartex" xmlns:mc="http://schemas.openxmlformats.org/markup-compatibility/2006" xmlns:aink="http://schemas.microsoft.com/office/drawing/2016/ink" xmlns:am3d="http://schemas.microsoft.com/office/drawing/2017/model3d" xmlns:o="urn:schemas-microsoft-com:office:office" xmlns:oel="http://schemas.microsoft.com/office/2019/extlst" xmlns:r="http://schemas.openxmlformats.org/officeDocument/2006/relationships" xmlns:m="http://schemas.openxmlformats.org/officeDocument/2006/math" xmlns:v="urn:schemas-microsoft-com:vml" xmlns:wp14="http://schemas.microsoft.com/office/word/2010/wordprocessingDrawing" xmlns:wp="http://schemas.openxmlformats.org/drawingml/2006/wordprocessingDrawing" xmlns:w10="urn:schemas-microsoft-com:office:word" xmlns:w="http://schemas.openxmlformats.org/wordprocessingml/2006/main" xmlns:w14="http://schemas.microsoft.com/office/word/2010/wordml" xmlns:w15="http://schemas.microsoft.com/office/word/2012/wordml" xmlns:w16cex="http://schemas.microsoft.com/office/word/2018/wordml/cex" xmlns:w16cid="http://schemas.microsoft.com/office/word/2016/wordml/cid" xmlns:w16="http://schemas.microsoft.com/office/word/2018/wordml" xmlns:w16du="http://schemas.microsoft.com/office/word/2023/wordml/word16du" xmlns:w16sdtdh="http://schemas.microsoft.com/office/word/2020/wordml/sdtdatahash" xmlns:w16se="http://schemas.microsoft.com/office/word/2015/wordml/symex" xmlns:wpg="http://schemas.microsoft.com/office/word/2010/wordprocessingGroup" xmlns:wpi="http://schemas.microsoft.com/office/word/2010/wordprocessingInk" xmlns:wne="http://schemas.microsoft.com/office/word/2006/wordml" xmlns:wps="http://schemas.microsoft.com/office/word/2010/wordprocessingShape" mc:Ignorable="w14 w15 w16se w16cid w16 w16cex w16sdtdh w16du wp14">
+<w:ftr xmlns:wpc="http://schemas.microsoft.com/office/word/2010/wordprocessingCanvas" xmlns:cx="http://schemas.microsoft.com/office/drawing/2014/chartex" xmlns:cx1="http://schemas.microsoft.com/office/drawing/2015/9/8/chartex" xmlns:cx2="http://schemas.microsoft.com/office/drawing/2015/10/21/chartex" xmlns:cx3="http://schemas.microsoft.com/office/drawing/2016/5/9/chartex" xmlns:cx4="http://schemas.microsoft.com/office/drawing/2016/5/10/chartex" xmlns:cx5="http://schemas.microsoft.com/office/drawing/2016/5/11/chartex" xmlns:cx6="http://schemas.microsoft.com/office/drawing/2016/5/12/chartex" xmlns:cx7="http://schemas.microsoft.com/office/drawing/2016/5/13/chartex" xmlns:cx8="http://schemas.microsoft.com/office/drawing/2016/5/14/chartex" xmlns:mc="http://schemas.openxmlformats.org/markup-compatibility/2006" xmlns:m="http://schemas.openxmlformats.org/officeDocument/2006/math" xmlns:aink="http://schemas.microsoft.com/office/drawing/2016/ink" xmlns:am3d="http://schemas.microsoft.com/office/drawing/2017/model3d" xmlns:oel="http://schemas.microsoft.com/office/2019/extlst" xmlns:r="http://schemas.openxmlformats.org/officeDocument/2006/relationships" xmlns:wp14="http://schemas.microsoft.com/office/word/2010/wordprocessingDrawing" xmlns:wp="http://schemas.openxmlformats.org/drawingml/2006/wordprocessingDrawing" xmlns:wpg="http://schemas.microsoft.com/office/word/2010/wordprocessingGroup" xmlns:wpi="http://schemas.microsoft.com/office/word/2010/wordprocessingInk" xmlns:wps="http://schemas.microsoft.com/office/word/2010/wordprocessingShape" xmlns:o="urn:schemas-microsoft-com:office:office" xmlns:v="urn:schemas-microsoft-com:vml" xmlns:w10="urn:schemas-microsoft-com:office:word" xmlns:w="http://schemas.openxmlformats.org/wordprocessingml/2006/main" xmlns:w14="http://schemas.microsoft.com/office/word/2010/wordml" xmlns:w15="http://schemas.microsoft.com/office/word/2012/wordml" xmlns:w16cex="http://schemas.microsoft.com/office/word/2018/wordml/cex" xmlns:w16cid="http://schemas.microsoft.com/office/word/2016/wordml/cid" xmlns:w16="http://schemas.microsoft.com/office/word/2018/wordml" xmlns:w16sdtdh="http://schemas.microsoft.com/office/word/2020/wordml/sdtdatahash" xmlns:w16sdtfl="http://schemas.microsoft.com/office/word/2024/wordml/sdtformatlock" xmlns:w16se="http://schemas.microsoft.com/office/word/2015/wordml/symex" xmlns:w16du="http://schemas.microsoft.com/office/word/2023/wordml/word16du" xmlns:wne="http://schemas.microsoft.com/office/word/2006/wordml" mc:Ignorable="w14 w15 w16se w16cid w16 w16cex w16sdtdh w16sdtfl w16du wp14">
   <w:sdt>
     <w:sdtPr>
       <w:rPr>
@@ -4509,7 +4536,7 @@
 </file>
 
 <file path=word/footer3.xml><?xml version="1.0" encoding="utf-8"?>
-<w:ftr xmlns:wpc="http://schemas.microsoft.com/office/word/2010/wordprocessingCanvas" xmlns:cx="http://schemas.microsoft.com/office/drawing/2014/chartex" xmlns:cx1="http://schemas.microsoft.com/office/drawing/2015/9/8/chartex" xmlns:cx2="http://schemas.microsoft.com/office/drawing/2015/10/21/chartex" xmlns:cx3="http://schemas.microsoft.com/office/drawing/2016/5/9/chartex" xmlns:cx4="http://schemas.microsoft.com/office/drawing/2016/5/10/chartex" xmlns:cx5="http://schemas.microsoft.com/office/drawing/2016/5/11/chartex" xmlns:cx6="http://schemas.microsoft.com/office/drawing/2016/5/12/chartex" xmlns:cx7="http://schemas.microsoft.com/office/drawing/2016/5/13/chartex" xmlns:cx8="http://schemas.microsoft.com/office/drawing/2016/5/14/chartex" xmlns:mc="http://schemas.openxmlformats.org/markup-compatibility/2006" xmlns:aink="http://schemas.microsoft.com/office/drawing/2016/ink" xmlns:am3d="http://schemas.microsoft.com/office/drawing/2017/model3d" xmlns:o="urn:schemas-microsoft-com:office:office" xmlns:oel="http://schemas.microsoft.com/office/2019/extlst" xmlns:r="http://schemas.openxmlformats.org/officeDocument/2006/relationships" xmlns:m="http://schemas.openxmlformats.org/officeDocument/2006/math" xmlns:v="urn:schemas-microsoft-com:vml" xmlns:wp14="http://schemas.microsoft.com/office/word/2010/wordprocessingDrawing" xmlns:wp="http://schemas.openxmlformats.org/drawingml/2006/wordprocessingDrawing" xmlns:w10="urn:schemas-microsoft-com:office:word" xmlns:w="http://schemas.openxmlformats.org/wordprocessingml/2006/main" xmlns:w14="http://schemas.microsoft.com/office/word/2010/wordml" xmlns:w15="http://schemas.microsoft.com/office/word/2012/wordml" xmlns:w16cex="http://schemas.microsoft.com/office/word/2018/wordml/cex" xmlns:w16cid="http://schemas.microsoft.com/office/word/2016/wordml/cid" xmlns:w16="http://schemas.microsoft.com/office/word/2018/wordml" xmlns:w16du="http://schemas.microsoft.com/office/word/2023/wordml/word16du" xmlns:w16sdtdh="http://schemas.microsoft.com/office/word/2020/wordml/sdtdatahash" xmlns:w16se="http://schemas.microsoft.com/office/word/2015/wordml/symex" xmlns:wpg="http://schemas.microsoft.com/office/word/2010/wordprocessingGroup" xmlns:wpi="http://schemas.microsoft.com/office/word/2010/wordprocessingInk" xmlns:wne="http://schemas.microsoft.com/office/word/2006/wordml" xmlns:wps="http://schemas.microsoft.com/office/word/2010/wordprocessingShape" mc:Ignorable="w14 w15 w16se w16cid w16 w16cex w16sdtdh w16du wp14">
+<w:ftr xmlns:wpc="http://schemas.microsoft.com/office/word/2010/wordprocessingCanvas" xmlns:cx="http://schemas.microsoft.com/office/drawing/2014/chartex" xmlns:cx1="http://schemas.microsoft.com/office/drawing/2015/9/8/chartex" xmlns:cx2="http://schemas.microsoft.com/office/drawing/2015/10/21/chartex" xmlns:cx3="http://schemas.microsoft.com/office/drawing/2016/5/9/chartex" xmlns:cx4="http://schemas.microsoft.com/office/drawing/2016/5/10/chartex" xmlns:cx5="http://schemas.microsoft.com/office/drawing/2016/5/11/chartex" xmlns:cx6="http://schemas.microsoft.com/office/drawing/2016/5/12/chartex" xmlns:cx7="http://schemas.microsoft.com/office/drawing/2016/5/13/chartex" xmlns:cx8="http://schemas.microsoft.com/office/drawing/2016/5/14/chartex" xmlns:mc="http://schemas.openxmlformats.org/markup-compatibility/2006" xmlns:m="http://schemas.openxmlformats.org/officeDocument/2006/math" xmlns:aink="http://schemas.microsoft.com/office/drawing/2016/ink" xmlns:am3d="http://schemas.microsoft.com/office/drawing/2017/model3d" xmlns:oel="http://schemas.microsoft.com/office/2019/extlst" xmlns:r="http://schemas.openxmlformats.org/officeDocument/2006/relationships" xmlns:wp14="http://schemas.microsoft.com/office/word/2010/wordprocessingDrawing" xmlns:wp="http://schemas.openxmlformats.org/drawingml/2006/wordprocessingDrawing" xmlns:wpg="http://schemas.microsoft.com/office/word/2010/wordprocessingGroup" xmlns:wpi="http://schemas.microsoft.com/office/word/2010/wordprocessingInk" xmlns:wps="http://schemas.microsoft.com/office/word/2010/wordprocessingShape" xmlns:o="urn:schemas-microsoft-com:office:office" xmlns:v="urn:schemas-microsoft-com:vml" xmlns:w10="urn:schemas-microsoft-com:office:word" xmlns:w="http://schemas.openxmlformats.org/wordprocessingml/2006/main" xmlns:w14="http://schemas.microsoft.com/office/word/2010/wordml" xmlns:w15="http://schemas.microsoft.com/office/word/2012/wordml" xmlns:w16cex="http://schemas.microsoft.com/office/word/2018/wordml/cex" xmlns:w16cid="http://schemas.microsoft.com/office/word/2016/wordml/cid" xmlns:w16="http://schemas.microsoft.com/office/word/2018/wordml" xmlns:w16sdtdh="http://schemas.microsoft.com/office/word/2020/wordml/sdtdatahash" xmlns:w16sdtfl="http://schemas.microsoft.com/office/word/2024/wordml/sdtformatlock" xmlns:w16se="http://schemas.microsoft.com/office/word/2015/wordml/symex" xmlns:w16du="http://schemas.microsoft.com/office/word/2023/wordml/word16du" xmlns:wne="http://schemas.microsoft.com/office/word/2006/wordml" mc:Ignorable="w14 w15 w16se w16cid w16 w16cex w16sdtdh w16sdtfl w16du wp14">
   <w:p>
     <w:pPr>
       <w:pStyle w:val="Footer"/>
@@ -4519,7 +4546,7 @@
 </file>
 
 <file path=word/footnotes.xml><?xml version="1.0" encoding="utf-8"?>
-<w:footnotes xmlns:wpc="http://schemas.microsoft.com/office/word/2010/wordprocessingCanvas" xmlns:cx="http://schemas.microsoft.com/office/drawing/2014/chartex" xmlns:cx1="http://schemas.microsoft.com/office/drawing/2015/9/8/chartex" xmlns:cx2="http://schemas.microsoft.com/office/drawing/2015/10/21/chartex" xmlns:cx3="http://schemas.microsoft.com/office/drawing/2016/5/9/chartex" xmlns:cx4="http://schemas.microsoft.com/office/drawing/2016/5/10/chartex" xmlns:cx5="http://schemas.microsoft.com/office/drawing/2016/5/11/chartex" xmlns:cx6="http://schemas.microsoft.com/office/drawing/2016/5/12/chartex" xmlns:cx7="http://schemas.microsoft.com/office/drawing/2016/5/13/chartex" xmlns:cx8="http://schemas.microsoft.com/office/drawing/2016/5/14/chartex" xmlns:mc="http://schemas.openxmlformats.org/markup-compatibility/2006" xmlns:aink="http://schemas.microsoft.com/office/drawing/2016/ink" xmlns:am3d="http://schemas.microsoft.com/office/drawing/2017/model3d" xmlns:o="urn:schemas-microsoft-com:office:office" xmlns:oel="http://schemas.microsoft.com/office/2019/extlst" xmlns:r="http://schemas.openxmlformats.org/officeDocument/2006/relationships" xmlns:m="http://schemas.openxmlformats.org/officeDocument/2006/math" xmlns:v="urn:schemas-microsoft-com:vml" xmlns:wp14="http://schemas.microsoft.com/office/word/2010/wordprocessingDrawing" xmlns:wp="http://schemas.openxmlformats.org/drawingml/2006/wordprocessingDrawing" xmlns:w10="urn:schemas-microsoft-com:office:word" xmlns:w="http://schemas.openxmlformats.org/wordprocessingml/2006/main" xmlns:w14="http://schemas.microsoft.com/office/word/2010/wordml" xmlns:w15="http://schemas.microsoft.com/office/word/2012/wordml" xmlns:w16cex="http://schemas.microsoft.com/office/word/2018/wordml/cex" xmlns:w16cid="http://schemas.microsoft.com/office/word/2016/wordml/cid" xmlns:w16="http://schemas.microsoft.com/office/word/2018/wordml" xmlns:w16du="http://schemas.microsoft.com/office/word/2023/wordml/word16du" xmlns:w16sdtdh="http://schemas.microsoft.com/office/word/2020/wordml/sdtdatahash" xmlns:w16se="http://schemas.microsoft.com/office/word/2015/wordml/symex" xmlns:wpg="http://schemas.microsoft.com/office/word/2010/wordprocessingGroup" xmlns:wpi="http://schemas.microsoft.com/office/word/2010/wordprocessingInk" xmlns:wne="http://schemas.microsoft.com/office/word/2006/wordml" xmlns:wps="http://schemas.microsoft.com/office/word/2010/wordprocessingShape" mc:Ignorable="w14 w15 w16se w16cid w16 w16cex w16sdtdh w16du wp14">
+<w:footnotes xmlns:wpc="http://schemas.microsoft.com/office/word/2010/wordprocessingCanvas" xmlns:cx="http://schemas.microsoft.com/office/drawing/2014/chartex" xmlns:cx1="http://schemas.microsoft.com/office/drawing/2015/9/8/chartex" xmlns:cx2="http://schemas.microsoft.com/office/drawing/2015/10/21/chartex" xmlns:cx3="http://schemas.microsoft.com/office/drawing/2016/5/9/chartex" xmlns:cx4="http://schemas.microsoft.com/office/drawing/2016/5/10/chartex" xmlns:cx5="http://schemas.microsoft.com/office/drawing/2016/5/11/chartex" xmlns:cx6="http://schemas.microsoft.com/office/drawing/2016/5/12/chartex" xmlns:cx7="http://schemas.microsoft.com/office/drawing/2016/5/13/chartex" xmlns:cx8="http://schemas.microsoft.com/office/drawing/2016/5/14/chartex" xmlns:mc="http://schemas.openxmlformats.org/markup-compatibility/2006" xmlns:m="http://schemas.openxmlformats.org/officeDocument/2006/math" xmlns:aink="http://schemas.microsoft.com/office/drawing/2016/ink" xmlns:am3d="http://schemas.microsoft.com/office/drawing/2017/model3d" xmlns:oel="http://schemas.microsoft.com/office/2019/extlst" xmlns:r="http://schemas.openxmlformats.org/officeDocument/2006/relationships" xmlns:wp14="http://schemas.microsoft.com/office/word/2010/wordprocessingDrawing" xmlns:wp="http://schemas.openxmlformats.org/drawingml/2006/wordprocessingDrawing" xmlns:wpg="http://schemas.microsoft.com/office/word/2010/wordprocessingGroup" xmlns:wpi="http://schemas.microsoft.com/office/word/2010/wordprocessingInk" xmlns:wps="http://schemas.microsoft.com/office/word/2010/wordprocessingShape" xmlns:o="urn:schemas-microsoft-com:office:office" xmlns:v="urn:schemas-microsoft-com:vml" xmlns:w10="urn:schemas-microsoft-com:office:word" xmlns:w="http://schemas.openxmlformats.org/wordprocessingml/2006/main" xmlns:w14="http://schemas.microsoft.com/office/word/2010/wordml" xmlns:w15="http://schemas.microsoft.com/office/word/2012/wordml" xmlns:w16cex="http://schemas.microsoft.com/office/word/2018/wordml/cex" xmlns:w16cid="http://schemas.microsoft.com/office/word/2016/wordml/cid" xmlns:w16="http://schemas.microsoft.com/office/word/2018/wordml" xmlns:w16sdtdh="http://schemas.microsoft.com/office/word/2020/wordml/sdtdatahash" xmlns:w16sdtfl="http://schemas.microsoft.com/office/word/2024/wordml/sdtformatlock" xmlns:w16se="http://schemas.microsoft.com/office/word/2015/wordml/symex" xmlns:w16du="http://schemas.microsoft.com/office/word/2023/wordml/word16du" xmlns:wne="http://schemas.microsoft.com/office/word/2006/wordml" mc:Ignorable="w14 w15 w16se w16cid w16 w16cex w16sdtdh w16sdtfl w16du wp14">
   <w:footnote w:type="separator" w:id="-1">
     <w:p>
       <w:r>
@@ -4541,7 +4568,7 @@
 </file>
 
 <file path=word/header1.xml><?xml version="1.0" encoding="utf-8"?>
-<w:hdr xmlns:wpc="http://schemas.microsoft.com/office/word/2010/wordprocessingCanvas" xmlns:cx="http://schemas.microsoft.com/office/drawing/2014/chartex" xmlns:cx1="http://schemas.microsoft.com/office/drawing/2015/9/8/chartex" xmlns:cx2="http://schemas.microsoft.com/office/drawing/2015/10/21/chartex" xmlns:cx3="http://schemas.microsoft.com/office/drawing/2016/5/9/chartex" xmlns:cx4="http://schemas.microsoft.com/office/drawing/2016/5/10/chartex" xmlns:cx5="http://schemas.microsoft.com/office/drawing/2016/5/11/chartex" xmlns:cx6="http://schemas.microsoft.com/office/drawing/2016/5/12/chartex" xmlns:cx7="http://schemas.microsoft.com/office/drawing/2016/5/13/chartex" xmlns:cx8="http://schemas.microsoft.com/office/drawing/2016/5/14/chartex" xmlns:mc="http://schemas.openxmlformats.org/markup-compatibility/2006" xmlns:aink="http://schemas.microsoft.com/office/drawing/2016/ink" xmlns:am3d="http://schemas.microsoft.com/office/drawing/2017/model3d" xmlns:o="urn:schemas-microsoft-com:office:office" xmlns:oel="http://schemas.microsoft.com/office/2019/extlst" xmlns:r="http://schemas.openxmlformats.org/officeDocument/2006/relationships" xmlns:m="http://schemas.openxmlformats.org/officeDocument/2006/math" xmlns:v="urn:schemas-microsoft-com:vml" xmlns:wp14="http://schemas.microsoft.com/office/word/2010/wordprocessingDrawing" xmlns:wp="http://schemas.openxmlformats.org/drawingml/2006/wordprocessingDrawing" xmlns:w10="urn:schemas-microsoft-com:office:word" xmlns:w="http://schemas.openxmlformats.org/wordprocessingml/2006/main" xmlns:w14="http://schemas.microsoft.com/office/word/2010/wordml" xmlns:w15="http://schemas.microsoft.com/office/word/2012/wordml" xmlns:w16cex="http://schemas.microsoft.com/office/word/2018/wordml/cex" xmlns:w16cid="http://schemas.microsoft.com/office/word/2016/wordml/cid" xmlns:w16="http://schemas.microsoft.com/office/word/2018/wordml" xmlns:w16du="http://schemas.microsoft.com/office/word/2023/wordml/word16du" xmlns:w16sdtdh="http://schemas.microsoft.com/office/word/2020/wordml/sdtdatahash" xmlns:w16se="http://schemas.microsoft.com/office/word/2015/wordml/symex" xmlns:wpg="http://schemas.microsoft.com/office/word/2010/wordprocessingGroup" xmlns:wpi="http://schemas.microsoft.com/office/word/2010/wordprocessingInk" xmlns:wne="http://schemas.microsoft.com/office/word/2006/wordml" xmlns:wps="http://schemas.microsoft.com/office/word/2010/wordprocessingShape" mc:Ignorable="w14 w15 w16se w16cid w16 w16cex w16sdtdh w16du wp14">
+<w:hdr xmlns:wpc="http://schemas.microsoft.com/office/word/2010/wordprocessingCanvas" xmlns:cx="http://schemas.microsoft.com/office/drawing/2014/chartex" xmlns:cx1="http://schemas.microsoft.com/office/drawing/2015/9/8/chartex" xmlns:cx2="http://schemas.microsoft.com/office/drawing/2015/10/21/chartex" xmlns:cx3="http://schemas.microsoft.com/office/drawing/2016/5/9/chartex" xmlns:cx4="http://schemas.microsoft.com/office/drawing/2016/5/10/chartex" xmlns:cx5="http://schemas.microsoft.com/office/drawing/2016/5/11/chartex" xmlns:cx6="http://schemas.microsoft.com/office/drawing/2016/5/12/chartex" xmlns:cx7="http://schemas.microsoft.com/office/drawing/2016/5/13/chartex" xmlns:cx8="http://schemas.microsoft.com/office/drawing/2016/5/14/chartex" xmlns:mc="http://schemas.openxmlformats.org/markup-compatibility/2006" xmlns:m="http://schemas.openxmlformats.org/officeDocument/2006/math" xmlns:aink="http://schemas.microsoft.com/office/drawing/2016/ink" xmlns:am3d="http://schemas.microsoft.com/office/drawing/2017/model3d" xmlns:oel="http://schemas.microsoft.com/office/2019/extlst" xmlns:r="http://schemas.openxmlformats.org/officeDocument/2006/relationships" xmlns:wp14="http://schemas.microsoft.com/office/word/2010/wordprocessingDrawing" xmlns:wp="http://schemas.openxmlformats.org/drawingml/2006/wordprocessingDrawing" xmlns:wpg="http://schemas.microsoft.com/office/word/2010/wordprocessingGroup" xmlns:wpi="http://schemas.microsoft.com/office/word/2010/wordprocessingInk" xmlns:wps="http://schemas.microsoft.com/office/word/2010/wordprocessingShape" xmlns:o="urn:schemas-microsoft-com:office:office" xmlns:v="urn:schemas-microsoft-com:vml" xmlns:w10="urn:schemas-microsoft-com:office:word" xmlns:w="http://schemas.openxmlformats.org/wordprocessingml/2006/main" xmlns:w14="http://schemas.microsoft.com/office/word/2010/wordml" xmlns:w15="http://schemas.microsoft.com/office/word/2012/wordml" xmlns:w16cex="http://schemas.microsoft.com/office/word/2018/wordml/cex" xmlns:w16cid="http://schemas.microsoft.com/office/word/2016/wordml/cid" xmlns:w16="http://schemas.microsoft.com/office/word/2018/wordml" xmlns:w16sdtdh="http://schemas.microsoft.com/office/word/2020/wordml/sdtdatahash" xmlns:w16sdtfl="http://schemas.microsoft.com/office/word/2024/wordml/sdtformatlock" xmlns:w16se="http://schemas.microsoft.com/office/word/2015/wordml/symex" xmlns:w16du="http://schemas.microsoft.com/office/word/2023/wordml/word16du" xmlns:wne="http://schemas.microsoft.com/office/word/2006/wordml" mc:Ignorable="w14 w15 w16se w16cid w16 w16cex w16sdtdh w16sdtfl w16du wp14">
   <w:p>
     <w:pPr>
       <w:pStyle w:val="Header"/>
@@ -4551,7 +4578,7 @@
 </file>
 
 <file path=word/header2.xml><?xml version="1.0" encoding="utf-8"?>
-<w:hdr xmlns:wpc="http://schemas.microsoft.com/office/word/2010/wordprocessingCanvas" xmlns:cx="http://schemas.microsoft.com/office/drawing/2014/chartex" xmlns:cx1="http://schemas.microsoft.com/office/drawing/2015/9/8/chartex" xmlns:cx2="http://schemas.microsoft.com/office/drawing/2015/10/21/chartex" xmlns:cx3="http://schemas.microsoft.com/office/drawing/2016/5/9/chartex" xmlns:cx4="http://schemas.microsoft.com/office/drawing/2016/5/10/chartex" xmlns:cx5="http://schemas.microsoft.com/office/drawing/2016/5/11/chartex" xmlns:cx6="http://schemas.microsoft.com/office/drawing/2016/5/12/chartex" xmlns:cx7="http://schemas.microsoft.com/office/drawing/2016/5/13/chartex" xmlns:cx8="http://schemas.microsoft.com/office/drawing/2016/5/14/chartex" xmlns:mc="http://schemas.openxmlformats.org/markup-compatibility/2006" xmlns:aink="http://schemas.microsoft.com/office/drawing/2016/ink" xmlns:am3d="http://schemas.microsoft.com/office/drawing/2017/model3d" xmlns:o="urn:schemas-microsoft-com:office:office" xmlns:oel="http://schemas.microsoft.com/office/2019/extlst" xmlns:r="http://schemas.openxmlformats.org/officeDocument/2006/relationships" xmlns:m="http://schemas.openxmlformats.org/officeDocument/2006/math" xmlns:v="urn:schemas-microsoft-com:vml" xmlns:wp14="http://schemas.microsoft.com/office/word/2010/wordprocessingDrawing" xmlns:wp="http://schemas.openxmlformats.org/drawingml/2006/wordprocessingDrawing" xmlns:w10="urn:schemas-microsoft-com:office:word" xmlns:w="http://schemas.openxmlformats.org/wordprocessingml/2006/main" xmlns:w14="http://schemas.microsoft.com/office/word/2010/wordml" xmlns:w15="http://schemas.microsoft.com/office/word/2012/wordml" xmlns:w16cex="http://schemas.microsoft.com/office/word/2018/wordml/cex" xmlns:w16cid="http://schemas.microsoft.com/office/word/2016/wordml/cid" xmlns:w16="http://schemas.microsoft.com/office/word/2018/wordml" xmlns:w16du="http://schemas.microsoft.com/office/word/2023/wordml/word16du" xmlns:w16sdtdh="http://schemas.microsoft.com/office/word/2020/wordml/sdtdatahash" xmlns:w16se="http://schemas.microsoft.com/office/word/2015/wordml/symex" xmlns:wpg="http://schemas.microsoft.com/office/word/2010/wordprocessingGroup" xmlns:wpi="http://schemas.microsoft.com/office/word/2010/wordprocessingInk" xmlns:wne="http://schemas.microsoft.com/office/word/2006/wordml" xmlns:wps="http://schemas.microsoft.com/office/word/2010/wordprocessingShape" mc:Ignorable="w14 w15 w16se w16cid w16 w16cex w16sdtdh w16du wp14">
+<w:hdr xmlns:wpc="http://schemas.microsoft.com/office/word/2010/wordprocessingCanvas" xmlns:cx="http://schemas.microsoft.com/office/drawing/2014/chartex" xmlns:cx1="http://schemas.microsoft.com/office/drawing/2015/9/8/chartex" xmlns:cx2="http://schemas.microsoft.com/office/drawing/2015/10/21/chartex" xmlns:cx3="http://schemas.microsoft.com/office/drawing/2016/5/9/chartex" xmlns:cx4="http://schemas.microsoft.com/office/drawing/2016/5/10/chartex" xmlns:cx5="http://schemas.microsoft.com/office/drawing/2016/5/11/chartex" xmlns:cx6="http://schemas.microsoft.com/office/drawing/2016/5/12/chartex" xmlns:cx7="http://schemas.microsoft.com/office/drawing/2016/5/13/chartex" xmlns:cx8="http://schemas.microsoft.com/office/drawing/2016/5/14/chartex" xmlns:mc="http://schemas.openxmlformats.org/markup-compatibility/2006" xmlns:m="http://schemas.openxmlformats.org/officeDocument/2006/math" xmlns:aink="http://schemas.microsoft.com/office/drawing/2016/ink" xmlns:am3d="http://schemas.microsoft.com/office/drawing/2017/model3d" xmlns:oel="http://schemas.microsoft.com/office/2019/extlst" xmlns:r="http://schemas.openxmlformats.org/officeDocument/2006/relationships" xmlns:wp14="http://schemas.microsoft.com/office/word/2010/wordprocessingDrawing" xmlns:wp="http://schemas.openxmlformats.org/drawingml/2006/wordprocessingDrawing" xmlns:wpg="http://schemas.microsoft.com/office/word/2010/wordprocessingGroup" xmlns:wpi="http://schemas.microsoft.com/office/word/2010/wordprocessingInk" xmlns:wps="http://schemas.microsoft.com/office/word/2010/wordprocessingShape" xmlns:o="urn:schemas-microsoft-com:office:office" xmlns:v="urn:schemas-microsoft-com:vml" xmlns:w10="urn:schemas-microsoft-com:office:word" xmlns:w="http://schemas.openxmlformats.org/wordprocessingml/2006/main" xmlns:w14="http://schemas.microsoft.com/office/word/2010/wordml" xmlns:w15="http://schemas.microsoft.com/office/word/2012/wordml" xmlns:w16cex="http://schemas.microsoft.com/office/word/2018/wordml/cex" xmlns:w16cid="http://schemas.microsoft.com/office/word/2016/wordml/cid" xmlns:w16="http://schemas.microsoft.com/office/word/2018/wordml" xmlns:w16sdtdh="http://schemas.microsoft.com/office/word/2020/wordml/sdtdatahash" xmlns:w16sdtfl="http://schemas.microsoft.com/office/word/2024/wordml/sdtformatlock" xmlns:w16se="http://schemas.microsoft.com/office/word/2015/wordml/symex" xmlns:w16du="http://schemas.microsoft.com/office/word/2023/wordml/word16du" xmlns:wne="http://schemas.microsoft.com/office/word/2006/wordml" mc:Ignorable="w14 w15 w16se w16cid w16 w16cex w16sdtdh w16sdtfl w16du wp14">
   <w:p>
     <w:pPr>
       <w:pStyle w:val="Header"/>
@@ -4629,7 +4656,7 @@
 </file>
 
 <file path=word/header3.xml><?xml version="1.0" encoding="utf-8"?>
-<w:hdr xmlns:wpc="http://schemas.microsoft.com/office/word/2010/wordprocessingCanvas" xmlns:cx="http://schemas.microsoft.com/office/drawing/2014/chartex" xmlns:cx1="http://schemas.microsoft.com/office/drawing/2015/9/8/chartex" xmlns:cx2="http://schemas.microsoft.com/office/drawing/2015/10/21/chartex" xmlns:cx3="http://schemas.microsoft.com/office/drawing/2016/5/9/chartex" xmlns:cx4="http://schemas.microsoft.com/office/drawing/2016/5/10/chartex" xmlns:cx5="http://schemas.microsoft.com/office/drawing/2016/5/11/chartex" xmlns:cx6="http://schemas.microsoft.com/office/drawing/2016/5/12/chartex" xmlns:cx7="http://schemas.microsoft.com/office/drawing/2016/5/13/chartex" xmlns:cx8="http://schemas.microsoft.com/office/drawing/2016/5/14/chartex" xmlns:mc="http://schemas.openxmlformats.org/markup-compatibility/2006" xmlns:aink="http://schemas.microsoft.com/office/drawing/2016/ink" xmlns:am3d="http://schemas.microsoft.com/office/drawing/2017/model3d" xmlns:o="urn:schemas-microsoft-com:office:office" xmlns:oel="http://schemas.microsoft.com/office/2019/extlst" xmlns:r="http://schemas.openxmlformats.org/officeDocument/2006/relationships" xmlns:m="http://schemas.openxmlformats.org/officeDocument/2006/math" xmlns:v="urn:schemas-microsoft-com:vml" xmlns:wp14="http://schemas.microsoft.com/office/word/2010/wordprocessingDrawing" xmlns:wp="http://schemas.openxmlformats.org/drawingml/2006/wordprocessingDrawing" xmlns:w10="urn:schemas-microsoft-com:office:word" xmlns:w="http://schemas.openxmlformats.org/wordprocessingml/2006/main" xmlns:w14="http://schemas.microsoft.com/office/word/2010/wordml" xmlns:w15="http://schemas.microsoft.com/office/word/2012/wordml" xmlns:w16cex="http://schemas.microsoft.com/office/word/2018/wordml/cex" xmlns:w16cid="http://schemas.microsoft.com/office/word/2016/wordml/cid" xmlns:w16="http://schemas.microsoft.com/office/word/2018/wordml" xmlns:w16du="http://schemas.microsoft.com/office/word/2023/wordml/word16du" xmlns:w16sdtdh="http://schemas.microsoft.com/office/word/2020/wordml/sdtdatahash" xmlns:w16se="http://schemas.microsoft.com/office/word/2015/wordml/symex" xmlns:wpg="http://schemas.microsoft.com/office/word/2010/wordprocessingGroup" xmlns:wpi="http://schemas.microsoft.com/office/word/2010/wordprocessingInk" xmlns:wne="http://schemas.microsoft.com/office/word/2006/wordml" xmlns:wps="http://schemas.microsoft.com/office/word/2010/wordprocessingShape" mc:Ignorable="w14 w15 w16se w16cid w16 w16cex w16sdtdh w16du wp14">
+<w:hdr xmlns:wpc="http://schemas.microsoft.com/office/word/2010/wordprocessingCanvas" xmlns:cx="http://schemas.microsoft.com/office/drawing/2014/chartex" xmlns:cx1="http://schemas.microsoft.com/office/drawing/2015/9/8/chartex" xmlns:cx2="http://schemas.microsoft.com/office/drawing/2015/10/21/chartex" xmlns:cx3="http://schemas.microsoft.com/office/drawing/2016/5/9/chartex" xmlns:cx4="http://schemas.microsoft.com/office/drawing/2016/5/10/chartex" xmlns:cx5="http://schemas.microsoft.com/office/drawing/2016/5/11/chartex" xmlns:cx6="http://schemas.microsoft.com/office/drawing/2016/5/12/chartex" xmlns:cx7="http://schemas.microsoft.com/office/drawing/2016/5/13/chartex" xmlns:cx8="http://schemas.microsoft.com/office/drawing/2016/5/14/chartex" xmlns:mc="http://schemas.openxmlformats.org/markup-compatibility/2006" xmlns:m="http://schemas.openxmlformats.org/officeDocument/2006/math" xmlns:aink="http://schemas.microsoft.com/office/drawing/2016/ink" xmlns:am3d="http://schemas.microsoft.com/office/drawing/2017/model3d" xmlns:oel="http://schemas.microsoft.com/office/2019/extlst" xmlns:r="http://schemas.openxmlformats.org/officeDocument/2006/relationships" xmlns:wp14="http://schemas.microsoft.com/office/word/2010/wordprocessingDrawing" xmlns:wp="http://schemas.openxmlformats.org/drawingml/2006/wordprocessingDrawing" xmlns:wpg="http://schemas.microsoft.com/office/word/2010/wordprocessingGroup" xmlns:wpi="http://schemas.microsoft.com/office/word/2010/wordprocessingInk" xmlns:wps="http://schemas.microsoft.com/office/word/2010/wordprocessingShape" xmlns:o="urn:schemas-microsoft-com:office:office" xmlns:v="urn:schemas-microsoft-com:vml" xmlns:w10="urn:schemas-microsoft-com:office:word" xmlns:w="http://schemas.openxmlformats.org/wordprocessingml/2006/main" xmlns:w14="http://schemas.microsoft.com/office/word/2010/wordml" xmlns:w15="http://schemas.microsoft.com/office/word/2012/wordml" xmlns:w16cex="http://schemas.microsoft.com/office/word/2018/wordml/cex" xmlns:w16cid="http://schemas.microsoft.com/office/word/2016/wordml/cid" xmlns:w16="http://schemas.microsoft.com/office/word/2018/wordml" xmlns:w16sdtdh="http://schemas.microsoft.com/office/word/2020/wordml/sdtdatahash" xmlns:w16sdtfl="http://schemas.microsoft.com/office/word/2024/wordml/sdtformatlock" xmlns:w16se="http://schemas.microsoft.com/office/word/2015/wordml/symex" xmlns:w16du="http://schemas.microsoft.com/office/word/2023/wordml/word16du" xmlns:wne="http://schemas.microsoft.com/office/word/2006/wordml" mc:Ignorable="w14 w15 w16se w16cid w16 w16cex w16sdtdh w16sdtfl w16du wp14">
   <w:p>
     <w:pPr>
       <w:pStyle w:val="Header"/>
@@ -4639,7 +4666,7 @@
 </file>
 
 <file path=word/numbering.xml><?xml version="1.0" encoding="utf-8"?>
-<w:numbering xmlns:wpc="http://schemas.microsoft.com/office/word/2010/wordprocessingCanvas" xmlns:cx="http://schemas.microsoft.com/office/drawing/2014/chartex" xmlns:cx1="http://schemas.microsoft.com/office/drawing/2015/9/8/chartex" xmlns:cx2="http://schemas.microsoft.com/office/drawing/2015/10/21/chartex" xmlns:cx3="http://schemas.microsoft.com/office/drawing/2016/5/9/chartex" xmlns:cx4="http://schemas.microsoft.com/office/drawing/2016/5/10/chartex" xmlns:cx5="http://schemas.microsoft.com/office/drawing/2016/5/11/chartex" xmlns:cx6="http://schemas.microsoft.com/office/drawing/2016/5/12/chartex" xmlns:cx7="http://schemas.microsoft.com/office/drawing/2016/5/13/chartex" xmlns:cx8="http://schemas.microsoft.com/office/drawing/2016/5/14/chartex" xmlns:mc="http://schemas.openxmlformats.org/markup-compatibility/2006" xmlns:aink="http://schemas.microsoft.com/office/drawing/2016/ink" xmlns:am3d="http://schemas.microsoft.com/office/drawing/2017/model3d" xmlns:o="urn:schemas-microsoft-com:office:office" xmlns:oel="http://schemas.microsoft.com/office/2019/extlst" xmlns:r="http://schemas.openxmlformats.org/officeDocument/2006/relationships" xmlns:m="http://schemas.openxmlformats.org/officeDocument/2006/math" xmlns:v="urn:schemas-microsoft-com:vml" xmlns:wp14="http://schemas.microsoft.com/office/word/2010/wordprocessingDrawing" xmlns:wp="http://schemas.openxmlformats.org/drawingml/2006/wordprocessingDrawing" xmlns:w10="urn:schemas-microsoft-com:office:word" xmlns:w="http://schemas.openxmlformats.org/wordprocessingml/2006/main" xmlns:w14="http://schemas.microsoft.com/office/word/2010/wordml" xmlns:w15="http://schemas.microsoft.com/office/word/2012/wordml" xmlns:w16cex="http://schemas.microsoft.com/office/word/2018/wordml/cex" xmlns:w16cid="http://schemas.microsoft.com/office/word/2016/wordml/cid" xmlns:w16="http://schemas.microsoft.com/office/word/2018/wordml" xmlns:w16du="http://schemas.microsoft.com/office/word/2023/wordml/word16du" xmlns:w16sdtdh="http://schemas.microsoft.com/office/word/2020/wordml/sdtdatahash" xmlns:w16se="http://schemas.microsoft.com/office/word/2015/wordml/symex" xmlns:wpg="http://schemas.microsoft.com/office/word/2010/wordprocessingGroup" xmlns:wpi="http://schemas.microsoft.com/office/word/2010/wordprocessingInk" xmlns:wne="http://schemas.microsoft.com/office/word/2006/wordml" xmlns:wps="http://schemas.microsoft.com/office/word/2010/wordprocessingShape" mc:Ignorable="w14 w15 w16se w16cid w16 w16cex w16sdtdh w16du wp14">
+<w:numbering xmlns:wpc="http://schemas.microsoft.com/office/word/2010/wordprocessingCanvas" xmlns:cx="http://schemas.microsoft.com/office/drawing/2014/chartex" xmlns:cx1="http://schemas.microsoft.com/office/drawing/2015/9/8/chartex" xmlns:cx2="http://schemas.microsoft.com/office/drawing/2015/10/21/chartex" xmlns:cx3="http://schemas.microsoft.com/office/drawing/2016/5/9/chartex" xmlns:cx4="http://schemas.microsoft.com/office/drawing/2016/5/10/chartex" xmlns:cx5="http://schemas.microsoft.com/office/drawing/2016/5/11/chartex" xmlns:cx6="http://schemas.microsoft.com/office/drawing/2016/5/12/chartex" xmlns:cx7="http://schemas.microsoft.com/office/drawing/2016/5/13/chartex" xmlns:cx8="http://schemas.microsoft.com/office/drawing/2016/5/14/chartex" xmlns:mc="http://schemas.openxmlformats.org/markup-compatibility/2006" xmlns:m="http://schemas.openxmlformats.org/officeDocument/2006/math" xmlns:aink="http://schemas.microsoft.com/office/drawing/2016/ink" xmlns:am3d="http://schemas.microsoft.com/office/drawing/2017/model3d" xmlns:oel="http://schemas.microsoft.com/office/2019/extlst" xmlns:r="http://schemas.openxmlformats.org/officeDocument/2006/relationships" xmlns:wp14="http://schemas.microsoft.com/office/word/2010/wordprocessingDrawing" xmlns:wp="http://schemas.openxmlformats.org/drawingml/2006/wordprocessingDrawing" xmlns:wpg="http://schemas.microsoft.com/office/word/2010/wordprocessingGroup" xmlns:wpi="http://schemas.microsoft.com/office/word/2010/wordprocessingInk" xmlns:wps="http://schemas.microsoft.com/office/word/2010/wordprocessingShape" xmlns:o="urn:schemas-microsoft-com:office:office" xmlns:v="urn:schemas-microsoft-com:vml" xmlns:w10="urn:schemas-microsoft-com:office:word" xmlns:w="http://schemas.openxmlformats.org/wordprocessingml/2006/main" xmlns:w14="http://schemas.microsoft.com/office/word/2010/wordml" xmlns:w15="http://schemas.microsoft.com/office/word/2012/wordml" xmlns:w16cex="http://schemas.microsoft.com/office/word/2018/wordml/cex" xmlns:w16cid="http://schemas.microsoft.com/office/word/2016/wordml/cid" xmlns:w16="http://schemas.microsoft.com/office/word/2018/wordml" xmlns:w16sdtdh="http://schemas.microsoft.com/office/word/2020/wordml/sdtdatahash" xmlns:w16sdtfl="http://schemas.microsoft.com/office/word/2024/wordml/sdtformatlock" xmlns:w16se="http://schemas.microsoft.com/office/word/2015/wordml/symex" xmlns:w16du="http://schemas.microsoft.com/office/word/2023/wordml/word16du" xmlns:wne="http://schemas.microsoft.com/office/word/2006/wordml" mc:Ignorable="w14 w15 w16se w16cid w16 w16cex w16sdtdh w16sdtfl w16du wp14">
   <w:abstractNum w:abstractNumId="0" w15:restartNumberingAfterBreak="0">
     <w:nsid w:val="3E493554"/>
     <w:multiLevelType w:val="hybridMultilevel"/>
@@ -4848,7 +4875,7 @@
 </file>
 
 <file path=word/styles.xml><?xml version="1.0" encoding="utf-8"?>
-<w:styles xmlns:mc="http://schemas.openxmlformats.org/markup-compatibility/2006" xmlns:r="http://schemas.openxmlformats.org/officeDocument/2006/relationships" xmlns:w="http://schemas.openxmlformats.org/wordprocessingml/2006/main" xmlns:w14="http://schemas.microsoft.com/office/word/2010/wordml" xmlns:w15="http://schemas.microsoft.com/office/word/2012/wordml" xmlns:w16cex="http://schemas.microsoft.com/office/word/2018/wordml/cex" xmlns:w16cid="http://schemas.microsoft.com/office/word/2016/wordml/cid" xmlns:w16="http://schemas.microsoft.com/office/word/2018/wordml" xmlns:w16du="http://schemas.microsoft.com/office/word/2023/wordml/word16du" xmlns:w16sdtdh="http://schemas.microsoft.com/office/word/2020/wordml/sdtdatahash" xmlns:w16se="http://schemas.microsoft.com/office/word/2015/wordml/symex" mc:Ignorable="w14 w15 w16se w16cid w16 w16cex w16sdtdh w16du">
+<w:styles xmlns:mc="http://schemas.openxmlformats.org/markup-compatibility/2006" xmlns:r="http://schemas.openxmlformats.org/officeDocument/2006/relationships" xmlns:w="http://schemas.openxmlformats.org/wordprocessingml/2006/main" xmlns:w14="http://schemas.microsoft.com/office/word/2010/wordml" xmlns:w15="http://schemas.microsoft.com/office/word/2012/wordml" xmlns:w16cex="http://schemas.microsoft.com/office/word/2018/wordml/cex" xmlns:w16cid="http://schemas.microsoft.com/office/word/2016/wordml/cid" xmlns:w16="http://schemas.microsoft.com/office/word/2018/wordml" xmlns:w16sdtdh="http://schemas.microsoft.com/office/word/2020/wordml/sdtdatahash" xmlns:w16sdtfl="http://schemas.microsoft.com/office/word/2024/wordml/sdtformatlock" xmlns:w16se="http://schemas.microsoft.com/office/word/2015/wordml/symex" xmlns:w16du="http://schemas.microsoft.com/office/word/2023/wordml/word16du" mc:Ignorable="w14 w15 w16se w16cid w16 w16cex w16sdtdh w16sdtfl w16du">
   <w:docDefaults>
     <w:rPrDefault>
       <w:rPr>
@@ -6305,6 +6332,26 @@
 </file>
 
 <file path=customXml/item1.xml><?xml version="1.0" encoding="utf-8"?>
+<?mso-contentType ?>
+<FormTemplates xmlns="http://schemas.microsoft.com/sharepoint/v3/contenttype/forms">
+  <Display>DocumentLibraryForm</Display>
+  <Edit>DocumentLibraryForm</Edit>
+  <New>DocumentLibraryForm</New>
+</FormTemplates>
+</file>
+
+<file path=customXml/item2.xml><?xml version="1.0" encoding="utf-8"?>
+<p:properties xmlns:p="http://schemas.microsoft.com/office/2006/metadata/properties" xmlns:xsi="http://www.w3.org/2001/XMLSchema-instance" xmlns:pc="http://schemas.microsoft.com/office/infopath/2007/PartnerControls">
+  <documentManagement>
+    <lcf76f155ced4ddcb4097134ff3c332f xmlns="5901cbfa-22a5-460e-a18e-d2e48de81980">
+      <Terms xmlns="http://schemas.microsoft.com/office/infopath/2007/PartnerControls"/>
+    </lcf76f155ced4ddcb4097134ff3c332f>
+    <TaxCatchAll xmlns="c68fef7c-f1b9-468c-b56b-b081b4f51826" xsi:nil="true"/>
+  </documentManagement>
+</p:properties>
+</file>
+
+<file path=customXml/item3.xml><?xml version="1.0" encoding="utf-8"?>
 <ct:contentTypeSchema xmlns:ct="http://schemas.microsoft.com/office/2006/metadata/contentType" xmlns:ma="http://schemas.microsoft.com/office/2006/metadata/properties/metaAttributes" ct:_="" ma:_="" ma:contentTypeName="Document" ma:contentTypeID="0x010100E3A4EFB22810614D921FE8B7E7DAEFA8" ma:contentTypeVersion="14" ma:contentTypeDescription="Create a new document." ma:contentTypeScope="" ma:versionID="244521d1350ace1b48ec0d9e0c7b13f4">
   <xsd:schema xmlns:xsd="http://www.w3.org/2001/XMLSchema" xmlns:xs="http://www.w3.org/2001/XMLSchema" xmlns:p="http://schemas.microsoft.com/office/2006/metadata/properties" xmlns:ns2="5901cbfa-22a5-460e-a18e-d2e48de81980" xmlns:ns3="c68fef7c-f1b9-468c-b56b-b081b4f51826" targetNamespace="http://schemas.microsoft.com/office/2006/metadata/properties" ma:root="true" ma:fieldsID="c1cb0894ef4fd2c5225ebadab417008d" ns2:_="" ns3:_="">
     <xsd:import namespace="5901cbfa-22a5-460e-a18e-d2e48de81980"/>
@@ -6533,27 +6580,26 @@
 </ct:contentTypeSchema>
 </file>
 
-<file path=customXml/item2.xml><?xml version="1.0" encoding="utf-8"?>
-<p:properties xmlns:p="http://schemas.microsoft.com/office/2006/metadata/properties" xmlns:xsi="http://www.w3.org/2001/XMLSchema-instance" xmlns:pc="http://schemas.microsoft.com/office/infopath/2007/PartnerControls">
-  <documentManagement>
-    <lcf76f155ced4ddcb4097134ff3c332f xmlns="5901cbfa-22a5-460e-a18e-d2e48de81980">
-      <Terms xmlns="http://schemas.microsoft.com/office/infopath/2007/PartnerControls"/>
-    </lcf76f155ced4ddcb4097134ff3c332f>
-    <TaxCatchAll xmlns="c68fef7c-f1b9-468c-b56b-b081b4f51826" xsi:nil="true"/>
-  </documentManagement>
-</p:properties>
+<file path=customXml/itemProps1.xml><?xml version="1.0" encoding="utf-8"?>
+<ds:datastoreItem xmlns:ds="http://schemas.openxmlformats.org/officeDocument/2006/customXml" ds:itemID="{40F719DB-0709-4E1E-A6E7-0DC210E2B430}">
+  <ds:schemaRefs>
+    <ds:schemaRef ds:uri="http://schemas.microsoft.com/sharepoint/v3/contenttype/forms"/>
+  </ds:schemaRefs>
+</ds:datastoreItem>
 </file>
 
-<file path=customXml/item3.xml><?xml version="1.0" encoding="utf-8"?>
-<?mso-contentType ?>
-<FormTemplates xmlns="http://schemas.microsoft.com/sharepoint/v3/contenttype/forms">
-  <Display>DocumentLibraryForm</Display>
-  <Edit>DocumentLibraryForm</Edit>
-  <New>DocumentLibraryForm</New>
-</FormTemplates>
+<file path=customXml/itemProps2.xml><?xml version="1.0" encoding="utf-8"?>
+<ds:datastoreItem xmlns:ds="http://schemas.openxmlformats.org/officeDocument/2006/customXml" ds:itemID="{44E7DC94-E640-4357-A4F5-C1800EE32719}">
+  <ds:schemaRefs>
+    <ds:schemaRef ds:uri="http://schemas.microsoft.com/office/2006/metadata/properties"/>
+    <ds:schemaRef ds:uri="http://schemas.microsoft.com/office/infopath/2007/PartnerControls"/>
+    <ds:schemaRef ds:uri="5901cbfa-22a5-460e-a18e-d2e48de81980"/>
+    <ds:schemaRef ds:uri="c68fef7c-f1b9-468c-b56b-b081b4f51826"/>
+  </ds:schemaRefs>
+</ds:datastoreItem>
 </file>
 
-<file path=customXml/itemProps1.xml><?xml version="1.0" encoding="utf-8"?>
+<file path=customXml/itemProps3.xml><?xml version="1.0" encoding="utf-8"?>
 <ds:datastoreItem xmlns:ds="http://schemas.openxmlformats.org/officeDocument/2006/customXml" ds:itemID="{F5AD2A4B-B150-405E-A643-480161D60C51}">
   <ds:schemaRefs>
     <ds:schemaRef ds:uri="http://schemas.microsoft.com/office/2006/metadata/contentType"/>
@@ -6570,23 +6616,4 @@
     <ds:schemaRef ds:uri="http://schemas.microsoft.com/internal/obd"/>
   </ds:schemaRefs>
 </ds:datastoreItem>
-</file>
-
-<file path=customXml/itemProps2.xml><?xml version="1.0" encoding="utf-8"?>
-<ds:datastoreItem xmlns:ds="http://schemas.openxmlformats.org/officeDocument/2006/customXml" ds:itemID="{44E7DC94-E640-4357-A4F5-C1800EE32719}">
-  <ds:schemaRefs>
-    <ds:schemaRef ds:uri="http://schemas.microsoft.com/office/2006/metadata/properties"/>
-    <ds:schemaRef ds:uri="http://schemas.microsoft.com/office/infopath/2007/PartnerControls"/>
-    <ds:schemaRef ds:uri="5901cbfa-22a5-460e-a18e-d2e48de81980"/>
-    <ds:schemaRef ds:uri="c68fef7c-f1b9-468c-b56b-b081b4f51826"/>
-  </ds:schemaRefs>
-</ds:datastoreItem>
-</file>
-
-<file path=customXml/itemProps3.xml><?xml version="1.0" encoding="utf-8"?>
-<ds:datastoreItem xmlns:ds="http://schemas.openxmlformats.org/officeDocument/2006/customXml" ds:itemID="{40F719DB-0709-4E1E-A6E7-0DC210E2B430}">
-  <ds:schemaRefs>
-    <ds:schemaRef ds:uri="http://schemas.microsoft.com/sharepoint/v3/contenttype/forms"/>
-  </ds:schemaRefs>
-</ds:datastoreItem>
 </file>
</xml_diff>